<commit_message>
Adopt analyst's hand edits: cover and contents on page 1, footer, US spelling, short fact values
Co-Authored-By: Claude Opus 5.5 <noreply@anthropic.com>
Claude-Session: https://claude.ai/code/session_01ChEN58PbdXFZmwUoBZYBRb
</commit_message>
<xml_diff>
--- a/output/India_Profile_DRAFT.docx
+++ b/output/India_Profile_DRAFT.docx
@@ -3,27 +3,19 @@
 <w:document xmlns:wpc="http://schemas.microsoft.com/office/word/2010/wordprocessingCanvas" xmlns:mo="http://schemas.microsoft.com/office/mac/office/2008/main" xmlns:mc="http://schemas.openxmlformats.org/markup-compatibility/2006" xmlns:mv="urn:schemas-microsoft-com:mac:vml" xmlns:o="urn:schemas-microsoft-com:office:office" xmlns:r="http://schemas.openxmlformats.org/officeDocument/2006/relationships" xmlns:m="http://schemas.openxmlformats.org/officeDocument/2006/math" xmlns:v="urn:schemas-microsoft-com:vml" xmlns:wp14="http://schemas.microsoft.com/office/word/2010/wordprocessingDrawing" xmlns:wp="http://schemas.openxmlformats.org/drawingml/2006/wordprocessingDrawing" xmlns:w10="urn:schemas-microsoft-com:office:word" xmlns:w="http://schemas.openxmlformats.org/wordprocessingml/2006/main" xmlns:w14="http://schemas.microsoft.com/office/word/2010/wordml" xmlns:wpg="http://schemas.microsoft.com/office/word/2010/wordprocessingGroup" xmlns:wpi="http://schemas.microsoft.com/office/word/2010/wordprocessingInk" xmlns:wne="http://schemas.microsoft.com/office/word/2006/wordml" xmlns:wps="http://schemas.microsoft.com/office/word/2010/wordprocessingShape" mc:Ignorable="w14 wp14">
   <w:body>
     <w:p>
-      <w:pPr>
-        <w:spacing w:before="800" w:after="40"/>
-      </w:pPr>
       <w:r>
         <w:rPr>
           <w:b/>
-          <w:color w:val="6E6E6E"/>
-          <w:sz w:val="26"/>
+          <w:color w:val="CC0000"/>
+          <w:sz w:val="40"/>
         </w:rPr>
-        <w:t>COUNTRY PROFILE &amp; MARKET INTELLIGENCE</w:t>
+        <w:t xml:space="preserve">Country Profile: </w:t>
       </w:r>
-    </w:p>
-    <w:p>
-      <w:pPr>
-        <w:spacing w:after="560"/>
-      </w:pPr>
       <w:r>
         <w:rPr>
-          <w:b/>
-          <w:color w:val="D91F2C"/>
-          <w:sz w:val="80"/>
+          <w:b w:val="0"/>
+          <w:color w:val="CC0000"/>
+          <w:sz w:val="40"/>
         </w:rPr>
         <w:t>India</w:t>
       </w:r>
@@ -32,7 +24,7 @@
       <w:r>
         <w:drawing>
           <wp:inline xmlns:a="http://schemas.openxmlformats.org/drawingml/2006/main" xmlns:pic="http://schemas.openxmlformats.org/drawingml/2006/picture">
-            <wp:extent cx="5976000" cy="2689200"/>
+            <wp:extent cx="6188710" cy="2784920"/>
             <wp:docPr id="1" name="Picture 1"/>
             <wp:cNvGraphicFramePr>
               <a:graphicFrameLocks noChangeAspect="1"/>
@@ -53,7 +45,7 @@
                   <pic:spPr>
                     <a:xfrm>
                       <a:off x="0" y="0"/>
-                      <a:ext cx="5976000" cy="2689200"/>
+                      <a:ext cx="6188710" cy="2784920"/>
                     </a:xfrm>
                     <a:prstGeom prst="rect"/>
                   </pic:spPr>
@@ -66,44 +58,12 @@
     </w:p>
     <w:p>
       <w:pPr>
-        <w:spacing w:before="480"/>
-      </w:pPr>
-      <w:r>
-        <w:rPr>
-          <w:i/>
-          <w:color w:val="6E6E6E"/>
-          <w:sz w:val="20"/>
-        </w:rPr>
-        <w:t>Draft prepared 2026-09-24. Superscript numbers refer to the numbered sources in the companion document, India_Profile_DRAFT_SOURCES.docx. The CSI Assessment section requires completion from Cedars-Sinai's internal data.</w:t>
-      </w:r>
-    </w:p>
-    <w:p>
-      <w:pPr>
-        <w:spacing w:before="1200"/>
-        <w:jc w:val="right"/>
-      </w:pPr>
-      <w:r>
-        <w:rPr>
-          <w:b/>
-          <w:color w:val="6E6E6E"/>
-          <w:sz w:val="22"/>
-        </w:rPr>
-        <w:t>Cedars-Sinai  |  INTERNATIONAL</w:t>
-      </w:r>
-    </w:p>
-    <w:p>
-      <w:r>
-        <w:br w:type="page"/>
-      </w:r>
-    </w:p>
-    <w:p>
-      <w:pPr>
-        <w:spacing w:after="280"/>
+        <w:spacing w:before="240" w:after="280"/>
       </w:pPr>
       <w:r>
         <w:rPr>
           <w:color w:val="D91F2C"/>
-          <w:sz w:val="40"/>
+          <w:sz w:val="32"/>
         </w:rPr>
         <w:t>Table of Contents</w:t>
       </w:r>
@@ -111,7 +71,7 @@
     <w:p>
       <w:pPr>
         <w:tabs>
-          <w:tab w:pos="9411" w:val="right" w:leader="dot"/>
+          <w:tab w:pos="9746" w:val="right" w:leader="dot"/>
         </w:tabs>
         <w:spacing w:after="120" w:before="160"/>
         <w:ind w:left="0"/>
@@ -146,7 +106,7 @@
     <w:p>
       <w:pPr>
         <w:tabs>
-          <w:tab w:pos="9411" w:val="right" w:leader="dot"/>
+          <w:tab w:pos="9746" w:val="right" w:leader="dot"/>
         </w:tabs>
         <w:spacing w:after="80" w:before="0"/>
         <w:ind w:left="340"/>
@@ -181,7 +141,7 @@
     <w:p>
       <w:pPr>
         <w:tabs>
-          <w:tab w:pos="9411" w:val="right" w:leader="dot"/>
+          <w:tab w:pos="9746" w:val="right" w:leader="dot"/>
         </w:tabs>
         <w:spacing w:after="80" w:before="0"/>
         <w:ind w:left="340"/>
@@ -216,7 +176,7 @@
     <w:p>
       <w:pPr>
         <w:tabs>
-          <w:tab w:pos="9411" w:val="right" w:leader="dot"/>
+          <w:tab w:pos="9746" w:val="right" w:leader="dot"/>
         </w:tabs>
         <w:spacing w:after="80" w:before="0"/>
         <w:ind w:left="340"/>
@@ -251,7 +211,7 @@
     <w:p>
       <w:pPr>
         <w:tabs>
-          <w:tab w:pos="9411" w:val="right" w:leader="dot"/>
+          <w:tab w:pos="9746" w:val="right" w:leader="dot"/>
         </w:tabs>
         <w:spacing w:after="80" w:before="0"/>
         <w:ind w:left="340"/>
@@ -286,7 +246,7 @@
     <w:p>
       <w:pPr>
         <w:tabs>
-          <w:tab w:pos="9411" w:val="right" w:leader="dot"/>
+          <w:tab w:pos="9746" w:val="right" w:leader="dot"/>
         </w:tabs>
         <w:spacing w:after="120" w:before="160"/>
         <w:ind w:left="0"/>
@@ -321,7 +281,7 @@
     <w:p>
       <w:pPr>
         <w:tabs>
-          <w:tab w:pos="9411" w:val="right" w:leader="dot"/>
+          <w:tab w:pos="9746" w:val="right" w:leader="dot"/>
         </w:tabs>
         <w:spacing w:after="80" w:before="0"/>
         <w:ind w:left="340"/>
@@ -356,7 +316,7 @@
     <w:p>
       <w:pPr>
         <w:tabs>
-          <w:tab w:pos="9411" w:val="right" w:leader="dot"/>
+          <w:tab w:pos="9746" w:val="right" w:leader="dot"/>
         </w:tabs>
         <w:spacing w:after="80" w:before="0"/>
         <w:ind w:left="340"/>
@@ -391,7 +351,7 @@
     <w:p>
       <w:pPr>
         <w:tabs>
-          <w:tab w:pos="9411" w:val="right" w:leader="dot"/>
+          <w:tab w:pos="9746" w:val="right" w:leader="dot"/>
         </w:tabs>
         <w:spacing w:after="80" w:before="0"/>
         <w:ind w:left="340"/>
@@ -426,7 +386,7 @@
     <w:p>
       <w:pPr>
         <w:tabs>
-          <w:tab w:pos="9411" w:val="right" w:leader="dot"/>
+          <w:tab w:pos="9746" w:val="right" w:leader="dot"/>
         </w:tabs>
         <w:spacing w:after="80" w:before="0"/>
         <w:ind w:left="340"/>
@@ -461,7 +421,7 @@
     <w:p>
       <w:pPr>
         <w:tabs>
-          <w:tab w:pos="9411" w:val="right" w:leader="dot"/>
+          <w:tab w:pos="9746" w:val="right" w:leader="dot"/>
         </w:tabs>
         <w:spacing w:after="80" w:before="0"/>
         <w:ind w:left="340"/>
@@ -496,7 +456,7 @@
     <w:p>
       <w:pPr>
         <w:tabs>
-          <w:tab w:pos="9411" w:val="right" w:leader="dot"/>
+          <w:tab w:pos="9746" w:val="right" w:leader="dot"/>
         </w:tabs>
         <w:spacing w:after="80" w:before="0"/>
         <w:ind w:left="340"/>
@@ -531,7 +491,7 @@
     <w:p>
       <w:pPr>
         <w:tabs>
-          <w:tab w:pos="9411" w:val="right" w:leader="dot"/>
+          <w:tab w:pos="9746" w:val="right" w:leader="dot"/>
         </w:tabs>
         <w:spacing w:after="80" w:before="0"/>
         <w:ind w:left="340"/>
@@ -566,7 +526,7 @@
     <w:p>
       <w:pPr>
         <w:tabs>
-          <w:tab w:pos="9411" w:val="right" w:leader="dot"/>
+          <w:tab w:pos="9746" w:val="right" w:leader="dot"/>
         </w:tabs>
         <w:spacing w:after="120" w:before="160"/>
         <w:ind w:left="0"/>
@@ -601,7 +561,7 @@
     <w:p>
       <w:pPr>
         <w:tabs>
-          <w:tab w:pos="9411" w:val="right" w:leader="dot"/>
+          <w:tab w:pos="9746" w:val="right" w:leader="dot"/>
         </w:tabs>
         <w:spacing w:after="120" w:before="160"/>
         <w:ind w:left="0"/>
@@ -753,7 +713,7 @@
               <w:rPr>
                 <w:sz w:val="21"/>
               </w:rPr>
-              <w:t>Hindi is the official language of the Union, and Parliament has provided by law for the continued official use of English; the Eighth Schedule of the Constitution lists 22 languages</w:t>
+              <w:t>Hindi and English</w:t>
             </w:r>
             <w:hyperlink r:id="rId11">
               <w:r>
@@ -807,7 +767,7 @@
               <w:rPr>
                 <w:sz w:val="21"/>
               </w:rPr>
-              <w:t>About 1.46 billion (2025 estimate, UN World Population Prospects 2024); the world's most populous country</w:t>
+              <w:t>About 1.46 billion (2025 estimate)</w:t>
             </w:r>
             <w:hyperlink r:id="rId13">
               <w:r>
@@ -1010,7 +970,7 @@
               <w:rPr>
                 <w:sz w:val="21"/>
               </w:rPr>
-              <w:t>Parliamentary democratic republic with a federal structure; the Constitution describes India as a Union of States</w:t>
+              <w:t>Federal parliamentary democratic republic</w:t>
             </w:r>
             <w:hyperlink r:id="rId11">
               <w:r>
@@ -1505,7 +1465,7 @@
         </w:r>
       </w:hyperlink>
       <w:r>
-        <w:t xml:space="preserve"> For a foreign academic medical center, the ageing south and west and the National Capital Region are the most natural markets for high-acuity collaboration, while the younger northern states suit public-health and capacity-building work.</w:t>
+        <w:t xml:space="preserve"> For a foreign academic medical center, the aging south and west and the National Capital Region are the most natural markets for high-acuity collaboration, while the younger northern states suit public-health and capacity-building work.</w:t>
       </w:r>
     </w:p>
     <w:p>
@@ -2477,7 +2437,7 @@
     </w:p>
     <w:p>
       <w:r>
-        <w:t>India's public system is tiered. Sub-health centres and primary health centres, many upgraded into Ayushman Arogya Mandirs, feed community health centres, district hospitals, state medical college hospitals and national institutes such as AIIMS, PGIMER Chandigarh and Tata Memorial Centre.</w:t>
+        <w:t>India's public system is tiered. Sub-health centers and primary health centers, many upgraded into Ayushman Arogya Mandirs, feed community health centers, district hospitals, state medical college hospitals and national institutes such as AIIMS, PGIMER Chandigarh and Tata Memorial Centre.</w:t>
       </w:r>
       <w:hyperlink r:id="rId63">
         <w:r>
@@ -2533,7 +2493,7 @@
         </w:r>
       </w:hyperlink>
       <w:r>
-        <w:t xml:space="preserve"> PM-JAY, a tax-funded scheme, pays for up to Rs 5 lakh of hospital care per family per year across 1,961 procedures at more than 38,000 empanelled public and private hospitals, and since September 2024 it has covered everyone aged 70 and over.</w:t>
+        <w:t xml:space="preserve"> PM-JAY, a tax-funded scheme, pays for up to Rs 5 lakh of hospital care per family per year across 1,961 procedures at more than 38,000 empaneled public and private hospitals, and since September 2024 it has covered everyone aged 70 and over.</w:t>
       </w:r>
       <w:hyperlink r:id="rId66">
         <w:r>
@@ -2556,7 +2516,7 @@
     </w:p>
     <w:p>
       <w:r>
-        <w:t>Capacity is the main weakness. Public facilities from primary health centres to medical colleges had 8,18,661 beds on 31 March 2023, fewer than 0.6 per 1,000 people against the National Health Policy 2017 norm of 2, and supply is far thinner in Bihar and Uttar Pradesh.</w:t>
+        <w:t>Capacity is the main weakness. Public facilities from primary health centers to medical colleges had 8,18,661 beds on 31 March 2023, fewer than 0.6 per 1,000 people against the National Health Policy 2017 norm of 2, and supply is far thinner in Bihar and Uttar Pradesh.</w:t>
       </w:r>
       <w:hyperlink r:id="rId65">
         <w:r>
@@ -2577,7 +2537,7 @@
         </w:r>
       </w:hyperlink>
       <w:r>
-        <w:t xml:space="preserve"> Public care is much cheaper: average out-of-pocket spending per hospitalisation, excluding childbirth, was Rs 6,631 in public hospitals in 2025, against Rs 50,508 in private hospitals.</w:t>
+        <w:t xml:space="preserve"> Public care is much cheaper: average out-of-pocket spending per hospitalization, excluding childbirth, was Rs 6,631 in public hospitals in 2025, against Rs 50,508 in private hospitals.</w:t>
       </w:r>
       <w:hyperlink r:id="rId69">
         <w:r>
@@ -2613,7 +2573,7 @@
     </w:p>
     <w:p>
       <w:r>
-        <w:t>Private hospitals handled 57.9 percent of rural and 64.6 percent of urban hospitalisations in 2025, according to the NSS 80th round, counting those empanelled under government schemes.</w:t>
+        <w:t>Private hospitals handled 57.9 percent of rural and 64.6 percent of urban hospitalizations in 2025, according to the NSS 80th round, counting those empaneled under government schemes.</w:t>
       </w:r>
       <w:hyperlink r:id="rId71">
         <w:r>
@@ -3381,7 +3341,7 @@
         </w:r>
       </w:hyperlink>
       <w:r>
-        <w:t xml:space="preserve"> Health insurance coverage reached 47.4 percent in rural and 44.3 percent in urban areas in 2025, up from 14.1 and 19.1 percent in 2017-18, yet out-of-pocket spending still averaged Rs 34,064 per hospitalisation, excluding childbirth.</w:t>
+        <w:t xml:space="preserve"> Health insurance coverage reached 47.4 percent in rural and 44.3 percent in urban areas in 2025, up from 14.1 and 19.1 percent in 2017-18, yet out-of-pocket spending still averaged Rs 34,064 per hospitalization, excluding childbirth.</w:t>
       </w:r>
       <w:hyperlink r:id="rId69">
         <w:r>
@@ -3723,7 +3683,7 @@
               <w:rPr>
                 <w:sz w:val="21"/>
               </w:rPr>
-              <w:t>8,18,661 beds from primary health centres to medical colleges, fewer than 0.6 per 1,000 people (31 March 2023, Health Dynamics of India 2022-23), against a National Health Policy 2017 norm of 2 per 1,000</w:t>
+              <w:t>8,18,661 beds from primary health centers to medical colleges, fewer than 0.6 per 1,000 people (31 March 2023, Health Dynamics of India 2022-23), against a National Health Policy 2017 norm of 2 per 1,000</w:t>
             </w:r>
             <w:hyperlink r:id="rId65">
               <w:r>
@@ -3811,7 +3771,7 @@
               <w:rPr>
                 <w:sz w:val="21"/>
               </w:rPr>
-              <w:t>Roughly 4 practising doctors, 9.2 nurses and just over 4 hospital beds per 1,000 people (OECD averages, Health at a Glance 2025)</w:t>
+              <w:t>Roughly 4 practicing doctors, 9.2 nurses and just over 4 hospital beds per 1,000 people (OECD averages, Health at a Glance 2025)</w:t>
             </w:r>
             <w:hyperlink r:id="rId96">
               <w:r>
@@ -3851,7 +3811,7 @@
     </w:p>
     <w:p>
       <w:r>
-        <w:t>India's health workforce remains thin: it had 13.88 lakh registered allopathic doctors in December 2025, fewer than one per 1,000 people, and fewer still practise.</w:t>
+        <w:t>India's health workforce remains thin: it had 13.88 lakh registered allopathic doctors in December 2025, fewer than one per 1,000 people, and fewer still practice.</w:t>
       </w:r>
       <w:hyperlink r:id="rId90">
         <w:r>
@@ -3955,7 +3915,7 @@
         </w:r>
       </w:hyperlink>
       <w:r>
-        <w:t xml:space="preserve"> Shortages are worst in the northern states, and rural community health centres lacked 79.9 percent of their required specialists in March 2023.</w:t>
+        <w:t xml:space="preserve"> Shortages are worst in the northern states, and rural community health centers lacked 79.9 percent of their required specialists in March 2023.</w:t>
       </w:r>
       <w:hyperlink r:id="rId93">
         <w:r>
@@ -4299,7 +4259,7 @@
         </w:r>
       </w:hyperlink>
       <w:r>
-        <w:t xml:space="preserve"> Other risks include government health spending of only 1.48 percent of GDP in 2022-23, workforce shortfalls, the 2026 NEET cancellation, and possible US tariffs of up to 100 percent on buyers of Russian oil, authorised in September 2026.</w:t>
+        <w:t xml:space="preserve"> Other risks include government health spending of only 1.48 percent of GDP in 2022-23, workforce shortfalls, the 2026 NEET cancellation, and possible US tariffs of up to 100 percent on buyers of Russian oil, authorized in September 2026.</w:t>
       </w:r>
       <w:hyperlink r:id="rId33">
         <w:r>
@@ -4329,7 +4289,7 @@
         </w:r>
       </w:hyperlink>
       <w:r>
-        <w:t xml:space="preserve"> The outlook therefore favours foreign academic centers that bring training, protocols, quality systems and research to Indian partners rather than operating hospitals directly.</w:t>
+        <w:t xml:space="preserve"> The outlook therefore favors foreign academic centers that bring training, protocols, quality systems and research to Indian partners rather than operating hospitals directly.</w:t>
       </w:r>
     </w:p>
     <w:p>
@@ -4819,7 +4779,7 @@
                 <w:b w:val="0"/>
                 <w:sz w:val="19"/>
               </w:rPr>
-              <w:t>Exclusive long-term collaboration: centres of excellence, quality, technology and complex-case review</w:t>
+              <w:t>Exclusive long-term collaboration: centers of excellence, quality, technology and complex-case review</w:t>
             </w:r>
           </w:p>
         </w:tc>
@@ -5735,7 +5695,7 @@
         </w:r>
       </w:hyperlink>
       <w:r>
-        <w:t xml:space="preserve"> It covers oncology, cardiology, neurosciences and urology-nephrology centres, quality and technology, and joint review of complex cases, and Ramaiah's website still presents it.</w:t>
+        <w:t xml:space="preserve"> It covers oncology, cardiology, neurosciences and urology-nephrology centers, quality and technology, and joint review of complex cases, and Ramaiah's website still presents it.</w:t>
       </w:r>
       <w:hyperlink r:id="rId132">
         <w:r>
@@ -5787,7 +5747,7 @@
         <w:t xml:space="preserve">UCLA Health: </w:t>
       </w:r>
       <w:r>
-        <w:t>UCLA's OB/GYN department launched a resident exchange with Narendra Modi Medical College in 2024, began joint academic seminars in summer 2025 and completed the first phase of a postpartum-haemorrhage quality project with AIIMS New Delhi.</w:t>
+        <w:t>UCLA's OB/GYN department launched a resident exchange with Narendra Modi Medical College in 2024, began joint academic seminars in summer 2025 and completed the first phase of a postpartum-hemorrhage quality project with AIIMS New Delhi.</w:t>
       </w:r>
       <w:hyperlink r:id="rId136">
         <w:r>
@@ -6667,7 +6627,7 @@
         <w:spacing w:after="240"/>
       </w:pPr>
       <w:r>
-        <w:t>On the scheme's eighth anniversary, the Health Minister and the National Health Authority reported 13.25 crore funded hospital admissions worth Rs 2.03 lakh crore through more than 38,000 empanelled hospitals.</w:t>
+        <w:t>On the scheme's eighth anniversary, the Health Minister and the National Health Authority reported 13.25 crore funded hospital admissions worth Rs 2.03 lakh crore through more than 38,000 empaneled hospitals.</w:t>
       </w:r>
       <w:hyperlink r:id="rId66">
         <w:r>
@@ -6916,6 +6876,13 @@
       <w:pStyle w:val="Footer"/>
       <w:jc w:val="right"/>
     </w:pPr>
+    <w:r>
+      <w:rPr>
+        <w:color w:val="6E6E6E"/>
+        <w:sz w:val="18"/>
+      </w:rPr>
+      <w:t xml:space="preserve">Cedars-Sinai International   </w:t>
+    </w:r>
     <w:r>
       <w:rPr>
         <w:color w:val="6E6E6E"/>

</xml_diff>

<commit_message>
Sort grouped citation numbers ascending
Co-Authored-By: Claude Opus 5.5 <noreply@anthropic.com>
Claude-Session: https://claude.ai/code/session_01ChEN58PbdXFZmwUoBZYBRb
</commit_message>
<xml_diff>
--- a/output/India_Profile_DRAFT.docx
+++ b/output/India_Profile_DRAFT.docx
@@ -918,22 +918,22 @@
               </w:rPr>
               <w:t>About US$11,748 in current international dollars (2025, World Bank); about US$10,719 in 2024</w:t>
             </w:r>
+            <w:hyperlink r:id="rId16">
+              <w:r>
+                <w:rPr>
+                  <w:color w:val="B31822"/>
+                  <w:vertAlign w:val="superscript"/>
+                </w:rPr>
+                <w:t xml:space="preserve">6,</w:t>
+              </w:r>
+            </w:hyperlink>
             <w:hyperlink r:id="rId17">
               <w:r>
                 <w:rPr>
                   <w:color w:val="B31822"/>
                   <w:vertAlign w:val="superscript"/>
                 </w:rPr>
-                <w:t xml:space="preserve">7,</w:t>
-              </w:r>
-            </w:hyperlink>
-            <w:hyperlink r:id="rId16">
-              <w:r>
-                <w:rPr>
-                  <w:color w:val="B31822"/>
-                  <w:vertAlign w:val="superscript"/>
-                </w:rPr>
-                <w:t xml:space="preserve">6</w:t>
+                <w:t xml:space="preserve">7</w:t>
               </w:r>
             </w:hyperlink>
           </w:p>
@@ -1157,22 +1157,22 @@
               </w:rPr>
               <w:t>35.7% of total (2025, World Bank); 35.4% in 2024</w:t>
             </w:r>
+            <w:hyperlink r:id="rId16">
+              <w:r>
+                <w:rPr>
+                  <w:color w:val="B31822"/>
+                  <w:vertAlign w:val="superscript"/>
+                </w:rPr>
+                <w:t xml:space="preserve">6,</w:t>
+              </w:r>
+            </w:hyperlink>
             <w:hyperlink r:id="rId21">
               <w:r>
                 <w:rPr>
                   <w:color w:val="B31822"/>
                   <w:vertAlign w:val="superscript"/>
                 </w:rPr>
-                <w:t xml:space="preserve">11,</w:t>
-              </w:r>
-            </w:hyperlink>
-            <w:hyperlink r:id="rId16">
-              <w:r>
-                <w:rPr>
-                  <w:color w:val="B31822"/>
-                  <w:vertAlign w:val="superscript"/>
-                </w:rPr>
-                <w:t xml:space="preserve">6</w:t>
+                <w:t xml:space="preserve">11</w:t>
               </w:r>
             </w:hyperlink>
           </w:p>
@@ -1503,22 +1503,22 @@
       <w:r>
         <w:t xml:space="preserve"> The President is head of state, and executive power rests with the Prime Minister and the Council of Ministers, who are collectively responsible to the Lok Sabha.</w:t>
       </w:r>
+      <w:hyperlink r:id="rId11">
+        <w:r>
+          <w:rPr>
+            <w:color w:val="B31822"/>
+            <w:vertAlign w:val="superscript"/>
+          </w:rPr>
+          <w:t xml:space="preserve">1,</w:t>
+        </w:r>
+      </w:hyperlink>
       <w:hyperlink r:id="rId12">
         <w:r>
           <w:rPr>
             <w:color w:val="B31822"/>
             <w:vertAlign w:val="superscript"/>
           </w:rPr>
-          <w:t xml:space="preserve">2,</w:t>
-        </w:r>
-      </w:hyperlink>
-      <w:hyperlink r:id="rId11">
-        <w:r>
-          <w:rPr>
-            <w:color w:val="B31822"/>
-            <w:vertAlign w:val="superscript"/>
-          </w:rPr>
-          <w:t xml:space="preserve">1</w:t>
+          <w:t xml:space="preserve">2</w:t>
         </w:r>
       </w:hyperlink>
     </w:p>
@@ -2255,22 +2255,22 @@
       <w:r>
         <w:t xml:space="preserve"> The NCD share of deaths rose from 37.9 percent in 1990 to 61.8 percent in 2016 and was 66 percent in 2019, according to WHO.</w:t>
       </w:r>
+      <w:hyperlink r:id="rId47">
+        <w:r>
+          <w:rPr>
+            <w:color w:val="B31822"/>
+            <w:vertAlign w:val="superscript"/>
+          </w:rPr>
+          <w:t xml:space="preserve">37,</w:t>
+        </w:r>
+      </w:hyperlink>
       <w:hyperlink r:id="rId59">
         <w:r>
           <w:rPr>
             <w:color w:val="B31822"/>
             <w:vertAlign w:val="superscript"/>
           </w:rPr>
-          <w:t xml:space="preserve">49,</w:t>
-        </w:r>
-      </w:hyperlink>
-      <w:hyperlink r:id="rId47">
-        <w:r>
-          <w:rPr>
-            <w:color w:val="B31822"/>
-            <w:vertAlign w:val="superscript"/>
-          </w:rPr>
-          <w:t xml:space="preserve">37</w:t>
+          <w:t xml:space="preserve">49</w:t>
         </w:r>
       </w:hyperlink>
       <w:r>
@@ -2314,6 +2314,24 @@
       <w:r>
         <w:t xml:space="preserve"> Air pollution, high blood pressure, diet, high fasting plasma glucose and tobacco are leading risk factors, and air pollution was linked to about 2.1 million deaths in 2021.</w:t>
       </w:r>
+      <w:hyperlink r:id="rId56">
+        <w:r>
+          <w:rPr>
+            <w:color w:val="B31822"/>
+            <w:vertAlign w:val="superscript"/>
+          </w:rPr>
+          <w:t xml:space="preserve">46,</w:t>
+        </w:r>
+      </w:hyperlink>
+      <w:hyperlink r:id="rId57">
+        <w:r>
+          <w:rPr>
+            <w:color w:val="B31822"/>
+            <w:vertAlign w:val="superscript"/>
+          </w:rPr>
+          <w:t xml:space="preserve">47,</w:t>
+        </w:r>
+      </w:hyperlink>
       <w:hyperlink r:id="rId60">
         <w:r>
           <w:rPr>
@@ -2329,25 +2347,7 @@
             <w:color w:val="B31822"/>
             <w:vertAlign w:val="superscript"/>
           </w:rPr>
-          <w:t xml:space="preserve">51,</w:t>
-        </w:r>
-      </w:hyperlink>
-      <w:hyperlink r:id="rId56">
-        <w:r>
-          <w:rPr>
-            <w:color w:val="B31822"/>
-            <w:vertAlign w:val="superscript"/>
-          </w:rPr>
-          <w:t xml:space="preserve">46,</w:t>
-        </w:r>
-      </w:hyperlink>
-      <w:hyperlink r:id="rId57">
-        <w:r>
-          <w:rPr>
-            <w:color w:val="B31822"/>
-            <w:vertAlign w:val="superscript"/>
-          </w:rPr>
-          <w:t xml:space="preserve">47</w:t>
+          <w:t xml:space="preserve">51</w:t>
         </w:r>
       </w:hyperlink>
       <w:r>
@@ -2376,6 +2376,15 @@
       <w:r>
         <w:t>India had about a quarter of the world's TB cases in 2024 despite a 21 percent fall in incidence since 2015, and 57 percent of women aged 15 to 49 were anaemic in 2019-21.</w:t>
       </w:r>
+      <w:hyperlink r:id="rId52">
+        <w:r>
+          <w:rPr>
+            <w:color w:val="B31822"/>
+            <w:vertAlign w:val="superscript"/>
+          </w:rPr>
+          <w:t xml:space="preserve">42,</w:t>
+        </w:r>
+      </w:hyperlink>
       <w:hyperlink r:id="rId54">
         <w:r>
           <w:rPr>
@@ -2391,16 +2400,7 @@
             <w:color w:val="B31822"/>
             <w:vertAlign w:val="superscript"/>
           </w:rPr>
-          <w:t xml:space="preserve">45,</w:t>
-        </w:r>
-      </w:hyperlink>
-      <w:hyperlink r:id="rId52">
-        <w:r>
-          <w:rPr>
-            <w:color w:val="B31822"/>
-            <w:vertAlign w:val="superscript"/>
-          </w:rPr>
-          <w:t xml:space="preserve">42</w:t>
+          <w:t xml:space="preserve">45</w:t>
         </w:r>
       </w:hyperlink>
       <w:r>
@@ -2989,22 +2989,22 @@
               </w:rPr>
               <w:t>43.4% (2022-23), up from 39.4% in 2021-22 and down from 64.2% in 2013-14</w:t>
             </w:r>
+            <w:hyperlink r:id="rId85">
+              <w:r>
+                <w:rPr>
+                  <w:color w:val="B31822"/>
+                  <w:vertAlign w:val="superscript"/>
+                </w:rPr>
+                <w:t xml:space="preserve">75,</w:t>
+              </w:r>
+            </w:hyperlink>
             <w:hyperlink r:id="rId86">
               <w:r>
                 <w:rPr>
                   <w:color w:val="B31822"/>
                   <w:vertAlign w:val="superscript"/>
                 </w:rPr>
-                <w:t xml:space="preserve">76,</w:t>
-              </w:r>
-            </w:hyperlink>
-            <w:hyperlink r:id="rId85">
-              <w:r>
-                <w:rPr>
-                  <w:color w:val="B31822"/>
-                  <w:vertAlign w:val="superscript"/>
-                </w:rPr>
-                <w:t xml:space="preserve">75</w:t>
+                <w:t xml:space="preserve">76</w:t>
               </w:r>
             </w:hyperlink>
           </w:p>
@@ -3257,6 +3257,15 @@
           <w:t xml:space="preserve">23,</w:t>
         </w:r>
       </w:hyperlink>
+      <w:hyperlink r:id="rId85">
+        <w:r>
+          <w:rPr>
+            <w:color w:val="B31822"/>
+            <w:vertAlign w:val="superscript"/>
+          </w:rPr>
+          <w:t xml:space="preserve">75,</w:t>
+        </w:r>
+      </w:hyperlink>
       <w:hyperlink r:id="rId86">
         <w:r>
           <w:rPr>
@@ -3264,15 +3273,6 @@
             <w:vertAlign w:val="superscript"/>
           </w:rPr>
           <w:t xml:space="preserve">76,</w:t>
-        </w:r>
-      </w:hyperlink>
-      <w:hyperlink r:id="rId85">
-        <w:r>
-          <w:rPr>
-            <w:color w:val="B31822"/>
-            <w:vertAlign w:val="superscript"/>
-          </w:rPr>
-          <w:t xml:space="preserve">75,</w:t>
         </w:r>
       </w:hyperlink>
       <w:hyperlink r:id="rId87">
@@ -3313,13 +3313,13 @@
       <w:r>
         <w:t xml:space="preserve"> The out-of-pocket share had been 39.4 percent in COVID-affected 2021-22, and households paid more again once emergency spending ended.</w:t>
       </w:r>
-      <w:hyperlink r:id="rId89">
+      <w:hyperlink r:id="rId85">
         <w:r>
           <w:rPr>
             <w:color w:val="B31822"/>
             <w:vertAlign w:val="superscript"/>
           </w:rPr>
-          <w:t xml:space="preserve">79,</w:t>
+          <w:t xml:space="preserve">75,</w:t>
         </w:r>
       </w:hyperlink>
       <w:hyperlink r:id="rId86">
@@ -3331,13 +3331,13 @@
           <w:t xml:space="preserve">76,</w:t>
         </w:r>
       </w:hyperlink>
-      <w:hyperlink r:id="rId85">
+      <w:hyperlink r:id="rId89">
         <w:r>
           <w:rPr>
             <w:color w:val="B31822"/>
             <w:vertAlign w:val="superscript"/>
           </w:rPr>
-          <w:t xml:space="preserve">75</w:t>
+          <w:t xml:space="preserve">79</w:t>
         </w:r>
       </w:hyperlink>
       <w:r>
@@ -3579,22 +3579,22 @@
               </w:rPr>
               <w:t>Roughly 0.95 (2025, calculated from 13.88 lakh registered doctors and the UN 2025 population estimate; the active figure is lower)</w:t>
             </w:r>
+            <w:hyperlink r:id="rId13">
+              <w:r>
+                <w:rPr>
+                  <w:color w:val="B31822"/>
+                  <w:vertAlign w:val="superscript"/>
+                </w:rPr>
+                <w:t xml:space="preserve">3,</w:t>
+              </w:r>
+            </w:hyperlink>
             <w:hyperlink r:id="rId90">
               <w:r>
                 <w:rPr>
                   <w:color w:val="B31822"/>
                   <w:vertAlign w:val="superscript"/>
                 </w:rPr>
-                <w:t xml:space="preserve">80,</w:t>
-              </w:r>
-            </w:hyperlink>
-            <w:hyperlink r:id="rId13">
-              <w:r>
-                <w:rPr>
-                  <w:color w:val="B31822"/>
-                  <w:vertAlign w:val="superscript"/>
-                </w:rPr>
-                <w:t xml:space="preserve">3</w:t>
+                <w:t xml:space="preserve">80</w:t>
               </w:r>
             </w:hyperlink>
           </w:p>
@@ -3938,6 +3938,15 @@
       <w:r>
         <w:t xml:space="preserve"> The Union Budget 2026-27 plans to add 1 lakh allied health professionals over five years and train 1.5 lakh caregivers.</w:t>
       </w:r>
+      <w:hyperlink r:id="rId45">
+        <w:r>
+          <w:rPr>
+            <w:color w:val="B31822"/>
+            <w:vertAlign w:val="superscript"/>
+          </w:rPr>
+          <w:t xml:space="preserve">35,</w:t>
+        </w:r>
+      </w:hyperlink>
       <w:hyperlink r:id="rId46">
         <w:r>
           <w:rPr>
@@ -3953,16 +3962,7 @@
             <w:color w:val="B31822"/>
             <w:vertAlign w:val="superscript"/>
           </w:rPr>
-          <w:t xml:space="preserve">90,</w:t>
-        </w:r>
-      </w:hyperlink>
-      <w:hyperlink r:id="rId45">
-        <w:r>
-          <w:rPr>
-            <w:color w:val="B31822"/>
-            <w:vertAlign w:val="superscript"/>
-          </w:rPr>
-          <w:t xml:space="preserve">35</w:t>
+          <w:t xml:space="preserve">90</w:t>
         </w:r>
       </w:hyperlink>
       <w:r>
@@ -4051,22 +4051,22 @@
       <w:r>
         <w:t>NMC's seat matrix for 2026-27 lists 1,40,664 MBBS seats in 839 colleges, 64,121 of them in government colleges, against 51,348 seats in 2014.</w:t>
       </w:r>
+      <w:hyperlink r:id="rId90">
+        <w:r>
+          <w:rPr>
+            <w:color w:val="B31822"/>
+            <w:vertAlign w:val="superscript"/>
+          </w:rPr>
+          <w:t xml:space="preserve">80,</w:t>
+        </w:r>
+      </w:hyperlink>
       <w:hyperlink r:id="rId106">
         <w:r>
           <w:rPr>
             <w:color w:val="B31822"/>
             <w:vertAlign w:val="superscript"/>
           </w:rPr>
-          <w:t xml:space="preserve">96,</w:t>
-        </w:r>
-      </w:hyperlink>
-      <w:hyperlink r:id="rId90">
-        <w:r>
-          <w:rPr>
-            <w:color w:val="B31822"/>
-            <w:vertAlign w:val="superscript"/>
-          </w:rPr>
-          <w:t xml:space="preserve">80</w:t>
+          <w:t xml:space="preserve">96</w:t>
         </w:r>
       </w:hyperlink>
     </w:p>
@@ -4119,22 +4119,22 @@
       <w:r>
         <w:t xml:space="preserve"> Mayo Clinic's advisory role for Adani Health City's two planned medical colleges and the education pillar of Cleveland Clinic's Navi Mumbai MediCity show US institutions using graduate medical education as a way into India.</w:t>
       </w:r>
+      <w:hyperlink r:id="rId34">
+        <w:r>
+          <w:rPr>
+            <w:color w:val="B31822"/>
+            <w:vertAlign w:val="superscript"/>
+          </w:rPr>
+          <w:t xml:space="preserve">24,</w:t>
+        </w:r>
+      </w:hyperlink>
       <w:hyperlink r:id="rId110">
         <w:r>
           <w:rPr>
             <w:color w:val="B31822"/>
             <w:vertAlign w:val="superscript"/>
           </w:rPr>
-          <w:t xml:space="preserve">100,</w:t>
-        </w:r>
-      </w:hyperlink>
-      <w:hyperlink r:id="rId34">
-        <w:r>
-          <w:rPr>
-            <w:color w:val="B31822"/>
-            <w:vertAlign w:val="superscript"/>
-          </w:rPr>
-          <w:t xml:space="preserve">24</w:t>
+          <w:t xml:space="preserve">100</w:t>
         </w:r>
       </w:hyperlink>
     </w:p>
@@ -4208,22 +4208,22 @@
       <w:r>
         <w:t xml:space="preserve"> Maharashtra's Navi Mumbai MediCity, anchored by Cleveland Clinic under a June 2026 MoU, and Adani's two Health Cities, advised by Mayo Clinic, are the leading examples of integrated health cities.</w:t>
       </w:r>
+      <w:hyperlink r:id="rId110">
+        <w:r>
+          <w:rPr>
+            <w:color w:val="B31822"/>
+            <w:vertAlign w:val="superscript"/>
+          </w:rPr>
+          <w:t xml:space="preserve">100,</w:t>
+        </w:r>
+      </w:hyperlink>
       <w:hyperlink r:id="rId113">
         <w:r>
           <w:rPr>
             <w:color w:val="B31822"/>
             <w:vertAlign w:val="superscript"/>
           </w:rPr>
-          <w:t xml:space="preserve">103,</w:t>
-        </w:r>
-      </w:hyperlink>
-      <w:hyperlink r:id="rId110">
-        <w:r>
-          <w:rPr>
-            <w:color w:val="B31822"/>
-            <w:vertAlign w:val="superscript"/>
-          </w:rPr>
-          <w:t xml:space="preserve">100</w:t>
+          <w:t xml:space="preserve">103</w:t>
         </w:r>
       </w:hyperlink>
     </w:p>
@@ -4270,22 +4270,22 @@
           <w:t xml:space="preserve">23,</w:t>
         </w:r>
       </w:hyperlink>
+      <w:hyperlink r:id="rId43">
+        <w:r>
+          <w:rPr>
+            <w:color w:val="B31822"/>
+            <w:vertAlign w:val="superscript"/>
+          </w:rPr>
+          <w:t xml:space="preserve">33,</w:t>
+        </w:r>
+      </w:hyperlink>
       <w:hyperlink r:id="rId103">
         <w:r>
           <w:rPr>
             <w:color w:val="B31822"/>
             <w:vertAlign w:val="superscript"/>
           </w:rPr>
-          <w:t xml:space="preserve">93,</w:t>
-        </w:r>
-      </w:hyperlink>
-      <w:hyperlink r:id="rId43">
-        <w:r>
-          <w:rPr>
-            <w:color w:val="B31822"/>
-            <w:vertAlign w:val="superscript"/>
-          </w:rPr>
-          <w:t xml:space="preserve">33</w:t>
+          <w:t xml:space="preserve">93</w:t>
         </w:r>
       </w:hyperlink>
       <w:r>
@@ -4306,6 +4306,15 @@
       <w:r>
         <w:t>Leading US academic systems work in India mainly through advisory, network, second-opinion and education models rather than ownership, and several announced relationships are older or less visible than their headlines suggest. Foreign capital, by contrast, comes mainly from an Asian strategic owner and global private equity backing Indian hospital chains.</w:t>
       </w:r>
+      <w:hyperlink r:id="rId76">
+        <w:r>
+          <w:rPr>
+            <w:color w:val="B31822"/>
+            <w:vertAlign w:val="superscript"/>
+          </w:rPr>
+          <w:t xml:space="preserve">66,</w:t>
+        </w:r>
+      </w:hyperlink>
       <w:hyperlink r:id="rId81">
         <w:r>
           <w:rPr>
@@ -4313,15 +4322,6 @@
             <w:vertAlign w:val="superscript"/>
           </w:rPr>
           <w:t xml:space="preserve">71,</w:t>
-        </w:r>
-      </w:hyperlink>
-      <w:hyperlink r:id="rId76">
-        <w:r>
-          <w:rPr>
-            <w:color w:val="B31822"/>
-            <w:vertAlign w:val="superscript"/>
-          </w:rPr>
-          <w:t xml:space="preserve">66,</w:t>
         </w:r>
       </w:hyperlink>
       <w:hyperlink r:id="rId84">
@@ -6177,6 +6177,15 @@
       <w:r>
         <w:t xml:space="preserve"> Indian chains market lower-cost complex care to the same Gulf, African and Central Asian patients that US centers pursue, and the Union Budget 2026-27 backs five regional medical hubs to strengthen that position.</w:t>
       </w:r>
+      <w:hyperlink r:id="rId46">
+        <w:r>
+          <w:rPr>
+            <w:color w:val="B31822"/>
+            <w:vertAlign w:val="superscript"/>
+          </w:rPr>
+          <w:t xml:space="preserve">36,</w:t>
+        </w:r>
+      </w:hyperlink>
       <w:hyperlink r:id="rId114">
         <w:r>
           <w:rPr>
@@ -6192,16 +6201,7 @@
             <w:color w:val="B31822"/>
             <w:vertAlign w:val="superscript"/>
           </w:rPr>
-          <w:t xml:space="preserve">105,</w:t>
-        </w:r>
-      </w:hyperlink>
-      <w:hyperlink r:id="rId46">
-        <w:r>
-          <w:rPr>
-            <w:color w:val="B31822"/>
-            <w:vertAlign w:val="superscript"/>
-          </w:rPr>
-          <w:t xml:space="preserve">36</w:t>
+          <w:t xml:space="preserve">105</w:t>
         </w:r>
       </w:hyperlink>
     </w:p>
@@ -6434,6 +6434,15 @@
           <w:t xml:space="preserve">24,</w:t>
         </w:r>
       </w:hyperlink>
+      <w:hyperlink r:id="rId113">
+        <w:r>
+          <w:rPr>
+            <w:color w:val="B31822"/>
+            <w:vertAlign w:val="superscript"/>
+          </w:rPr>
+          <w:t xml:space="preserve">103,</w:t>
+        </w:r>
+      </w:hyperlink>
       <w:hyperlink r:id="rId123">
         <w:r>
           <w:rPr>
@@ -6449,16 +6458,7 @@
             <w:color w:val="B31822"/>
             <w:vertAlign w:val="superscript"/>
           </w:rPr>
-          <w:t xml:space="preserve">141,</w:t>
-        </w:r>
-      </w:hyperlink>
-      <w:hyperlink r:id="rId113">
-        <w:r>
-          <w:rPr>
-            <w:color w:val="B31822"/>
-            <w:vertAlign w:val="superscript"/>
-          </w:rPr>
-          <w:t xml:space="preserve">103</w:t>
+          <w:t xml:space="preserve">141</w:t>
         </w:r>
       </w:hyperlink>
       <w:r>
@@ -6508,6 +6508,15 @@
       <w:r>
         <w:t>Manipal Health Enterprises, with 49 hospitals and 13,037 licensed beds at 31 March 2026, listed on the NSE and BSE at about an 11 percent premium to its Rs 590 issue price.</w:t>
       </w:r>
+      <w:hyperlink r:id="rId72">
+        <w:r>
+          <w:rPr>
+            <w:color w:val="B31822"/>
+            <w:vertAlign w:val="superscript"/>
+          </w:rPr>
+          <w:t xml:space="preserve">62,</w:t>
+        </w:r>
+      </w:hyperlink>
       <w:hyperlink r:id="rId73">
         <w:r>
           <w:rPr>
@@ -6523,16 +6532,7 @@
             <w:color w:val="B31822"/>
             <w:vertAlign w:val="superscript"/>
           </w:rPr>
-          <w:t xml:space="preserve">142,</w:t>
-        </w:r>
-      </w:hyperlink>
-      <w:hyperlink r:id="rId72">
-        <w:r>
-          <w:rPr>
-            <w:color w:val="B31822"/>
-            <w:vertAlign w:val="superscript"/>
-          </w:rPr>
-          <w:t xml:space="preserve">62</w:t>
+          <w:t xml:space="preserve">142</w:t>
         </w:r>
       </w:hyperlink>
       <w:r>

</xml_diff>